<commit_message>
Add S2C project to portfolio
</commit_message>
<xml_diff>
--- a/Saatvik_Raghuvanshi_Resume_ATS.docx
+++ b/Saatvik_Raghuvanshi_Resume_ATS.docx
@@ -181,7 +181,7 @@
         <w:t xml:space="preserve">Frontend: </w:t>
       </w:r>
       <w:r>
-        <w:t>React.js, Next.js, TypeScript, Redux, Tailwind CSS, shadcn/ui, UI/UX, responsive web development</w:t>
+        <w:t>React.js, Next.js, TypeScript, Redux, Tailwind CSS, shadcn/ui, Radix UI, UI/UX, responsive web development</w:t>
       </w:r>
     </w:p>
     <w:p>
@@ -209,7 +209,7 @@
         <w:t xml:space="preserve">AI, Workflows, and Tools: </w:t>
       </w:r>
       <w:r>
-        <w:t>Gemini API, Inngest, Git, GitHub, Vercel, Netlify, cloud computing training</w:t>
+        <w:t>Gemini API, Inngest, Git, GitHub, Vercel, Netlify, ngrok, VS Code, Windows, cloud computing training</w:t>
       </w:r>
     </w:p>
     <w:p>
@@ -269,6 +269,14 @@
       </w:pPr>
       <w:r>
         <w:t>- Integrated Convex, Convex Auth, Convex Storage, Inngest, and Gemini-compatible API routes for database, authentication, storage, background jobs, and AI workflow orchestration.</w:t>
+      </w:r>
+    </w:p>
+    <w:p>
+      <w:pPr>
+        <w:pStyle w:val="ResumeBullet"/>
+      </w:pPr>
+      <w:r>
+        <w:t>- GitHub: https://github.com/saatvikraghuvanshi-lab/Ai-SaaS-Sketch-To-Design</w:t>
       </w:r>
     </w:p>
     <w:p>

</xml_diff>

<commit_message>
Refresh student profile and ATS resume
</commit_message>
<xml_diff>
--- a/Saatvik_Raghuvanshi_Resume_ATS.docx
+++ b/Saatvik_Raghuvanshi_Resume_ATS.docx
@@ -22,7 +22,7 @@
         <w:jc w:val="center"/>
       </w:pPr>
       <w:r>
-        <w:t>Product Engineer | Full-Stack Engineer (Frontend-Leaning) | Supabase/PostgreSQL</w:t>
+        <w:t>B.Tech CSE Student | Full-Stack Developer | Cloud Engineering Aspirant</w:t>
       </w:r>
     </w:p>
     <w:p>
@@ -88,7 +88,21 @@
     </w:p>
     <w:p>
       <w:r>
-        <w:t>Product-focused Software Engineer specializing in modern frontend frameworks and Backend-as-a-Service (BaaS) architectures. Proven track record of independently architecting, securing, and deploying full-stack web applications by bridging intuitive UI design with robust PostgreSQL database engineering.</w:t>
+        <w:t>B.Tech Computer Science student with hands-on experience building full-stack web applications, frontend interfaces, database-backed projects, AI-assisted workflows, and deployed portfolio projects. Experienced with React, Next.js, TypeScript, Supabase, PostgreSQL, Convex, Tailwind CSS, Git, GitHub, and Vercel through hackathons, ideathons, freelance work, and project-based learning.</w:t>
+      </w:r>
+    </w:p>
+    <w:p>
+      <w:pPr>
+        <w:pStyle w:val="ResumeHeading"/>
+        <w:keepNext/>
+      </w:pPr>
+      <w:r>
+        <w:t>TARGET ROLES</w:t>
+      </w:r>
+    </w:p>
+    <w:p>
+      <w:r>
+        <w:t>Cloud Engineer Intern, Full-Stack Developer Intern, Frontend Developer Intern, Web Developer Intern, Software Engineering Intern, Freelance Web Developer</w:t>
       </w:r>
     </w:p>
     <w:p>
@@ -124,7 +138,7 @@
         <w:pStyle w:val="ResumeBullet"/>
       </w:pPr>
       <w:r>
-        <w:t>- Current GPA: 7.0; completed first year coursework while building practical projects in full-stack development, APIs, UI/UX, and cloud-related tools.</w:t>
+        <w:t>- Current GPA: 7.0; completed first year coursework while building practical projects in full-stack development, APIs, UI/UX, databases, and cloud-related tools.</w:t>
       </w:r>
     </w:p>
     <w:p>
@@ -181,7 +195,7 @@
         <w:t xml:space="preserve">Frontend: </w:t>
       </w:r>
       <w:r>
-        <w:t>React.js, Next.js, TypeScript, Redux, Tailwind CSS, shadcn/ui, Radix UI, UI/UX, responsive web development</w:t>
+        <w:t>React.js, Next.js, TypeScript, JavaScript, Redux, Tailwind CSS, shadcn/ui, Radix UI, HTML, CSS, responsive web design, UI/UX</w:t>
       </w:r>
     </w:p>
     <w:p>
@@ -195,7 +209,7 @@
         <w:t xml:space="preserve">Backend and Database: </w:t>
       </w:r>
       <w:r>
-        <w:t>Node.js, PostgreSQL, Supabase, Convex, Convex Auth, Convex Storage, relational data modeling, Row Level Security (RLS), APIs</w:t>
+        <w:t>Node.js, PostgreSQL, Supabase, Convex, Convex Auth, Convex Storage, relational data modeling, Row Level Security (RLS), REST APIs, authentication</w:t>
       </w:r>
     </w:p>
     <w:p>
@@ -206,10 +220,10 @@
         <w:rPr>
           <w:b/>
         </w:rPr>
-        <w:t xml:space="preserve">AI, Workflows, and Tools: </w:t>
+        <w:t xml:space="preserve">Cloud, AI, and Workflows: </w:t>
       </w:r>
       <w:r>
-        <w:t>Gemini API, Inngest, Git, GitHub, Vercel, Netlify, ngrok, VS Code, Windows, cloud computing training</w:t>
+        <w:t>Google Cloud, Firebase, Gemini API, Inngest, cloud computing training, AI prompting, background jobs, deployment workflows</w:t>
       </w:r>
     </w:p>
     <w:p>
@@ -220,10 +234,24 @@
         <w:rPr>
           <w:b/>
         </w:rPr>
-        <w:t xml:space="preserve">Additional: </w:t>
+        <w:t xml:space="preserve">Developer Tools: </w:t>
       </w:r>
       <w:r>
-        <w:t>AutoCAD, drone building, line follower robots, GIS map integration, AI prompting, analytical problem solving</w:t>
+        <w:t>Git, GitHub, GitHub Docs, Vercel, Netlify, ngrok, Google Stitch, OpenAI Codex</w:t>
+      </w:r>
+    </w:p>
+    <w:p>
+      <w:pPr>
+        <w:spacing w:after="20"/>
+      </w:pPr>
+      <w:r>
+        <w:rPr>
+          <w:b/>
+        </w:rPr>
+        <w:t xml:space="preserve">Additional Technical Skills: </w:t>
+      </w:r>
+      <w:r>
+        <w:t>AutoCAD, drone building, line follower robots, GIS map integration, robotics fundamentals, analytical problem solving</w:t>
       </w:r>
     </w:p>
     <w:p>
@@ -252,7 +280,7 @@
         <w:pStyle w:val="ResumeBullet"/>
       </w:pPr>
       <w:r>
-        <w:t>- Built a full-stack AI SaaS-style design tool using Next.js, TypeScript, Convex, Inngest, Redux, Tailwind CSS, shadcn/ui, and Gemini API, covering authentication, projects, infinite canvas editing, autosave, and PNG/JSON exports.</w:t>
+        <w:t>- Built a full-stack AI SaaS-style design tool using Next.js, React, TypeScript, Convex, Inngest, Redux, Tailwind CSS, shadcn/ui, Radix UI, and Gemini API, covering authentication, projects, infinite canvas editing, autosave, and PNG/JSON exports.</w:t>
       </w:r>
     </w:p>
     <w:p>
@@ -268,7 +296,7 @@
         <w:pStyle w:val="ResumeBullet"/>
       </w:pPr>
       <w:r>
-        <w:t>- Integrated Convex, Convex Auth, Convex Storage, Inngest, and Gemini-compatible API routes for database, authentication, storage, background jobs, and AI workflow orchestration.</w:t>
+        <w:t>- Integrated Convex database, Convex Auth, Convex Storage, Inngest, and Gemini-compatible API routes for database operations, authentication, file storage, background jobs, and AI workflow orchestration.</w:t>
       </w:r>
     </w:p>
     <w:p>
@@ -354,7 +382,7 @@
         <w:pStyle w:val="ResumeBullet"/>
       </w:pPr>
       <w:r>
-        <w:t>- Built frontend and backend workflows for a unified disaster management system developed during Startup Forge Ideathon.</w:t>
+        <w:t>- Built frontend and backend workflows for a unified disaster management system developed during Startup Forge Ideathon, including admin, responder, civilian, training, strategy, and report views.</w:t>
       </w:r>
     </w:p>
     <w:p>
@@ -362,7 +390,7 @@
         <w:pStyle w:val="ResumeBullet"/>
       </w:pPr>
       <w:r>
-        <w:t>- Modeled data flows for emergency-response coordination, user-facing reporting, and operational information access.</w:t>
+        <w:t>- Modeled emergency-response data flows for map simulation, responder coordination, civilian SOS reporting, readiness training, and operational information access.</w:t>
       </w:r>
     </w:p>
     <w:p>
@@ -397,7 +425,7 @@
         <w:pStyle w:val="ResumeBullet"/>
       </w:pPr>
       <w:r>
-        <w:t>- Developed and deployed a civic-help oriented web application with structured service-access flows and user-facing data presentation.</w:t>
+        <w:t>- Developed and deployed a civic-help oriented web application for a college Vibeathon, using AI-assisted workflows to support government-scheme discovery and eligibility guidance.</w:t>
       </w:r>
     </w:p>
     <w:p>
@@ -405,7 +433,7 @@
         <w:pStyle w:val="ResumeBullet"/>
       </w:pPr>
       <w:r>
-        <w:t>- Applied frontend development, UI structuring, and web deployment practices using a Netlify-hosted workflow.</w:t>
+        <w:t>- Placed in the top 5 with a working prototype covering login, scheme discovery, filters, user dashboards, and an AI assistant flow.</w:t>
       </w:r>
     </w:p>
     <w:p>
@@ -432,7 +460,7 @@
         <w:pStyle w:val="ResumeBullet"/>
       </w:pPr>
       <w:r>
-        <w:t>- Built and deployed a GIS-oriented web application focused on map/data presentation and geospatial product workflows.</w:t>
+        <w:t>- Built and deployed a GIS-oriented web application focused on map-based field visualization, satellite imagery views, NDVI-style analytics, and rural dashboard workflows.</w:t>
       </w:r>
     </w:p>
     <w:p>
@@ -440,7 +468,7 @@
         <w:pStyle w:val="ResumeBullet"/>
       </w:pPr>
       <w:r>
-        <w:t>- Strengthened experience in integrating technical data views into accessible web interfaces.</w:t>
+        <w:t>- Strengthened experience in integrating geospatial data, map interfaces, technical metrics, and user-facing analytics into accessible web interfaces.</w:t>
       </w:r>
     </w:p>
     <w:p>
@@ -469,7 +497,7 @@
         <w:pStyle w:val="ResumeBullet"/>
       </w:pPr>
       <w:r>
-        <w:t>- Delivered a live web product for a freelance project, handling full-stack development responsibilities and deployment readiness.</w:t>
+        <w:t>- Delivered a live web product for a freelance project, handling full-stack development responsibilities, frontend implementation, database-backed workflows, and deployment readiness.</w:t>
       </w:r>
     </w:p>
     <w:p>
@@ -489,7 +517,7 @@
         <w:pStyle w:val="ResumeBullet"/>
       </w:pPr>
       <w:r>
-        <w:t>- Currently building foundational cloud computing knowledge aligned with a long-term cloud engineering career goal.</w:t>
+        <w:t>- Currently building foundational cloud computing knowledge aligned with cloud engineering internships, deployment workflows, backend services, and infrastructure fundamentals.</w:t>
       </w:r>
     </w:p>
     <w:p>

</xml_diff>

<commit_message>
Add S2C live project URL
</commit_message>
<xml_diff>
--- a/Saatvik_Raghuvanshi_Resume_ATS.docx
+++ b/Saatvik_Raghuvanshi_Resume_ATS.docx
@@ -267,12 +267,19 @@
       <w:pPr>
         <w:pStyle w:val="ResumeRole"/>
         <w:keepNext/>
+        <w:tabs>
+          <w:tab w:pos="9648" w:val="right"/>
+        </w:tabs>
       </w:pPr>
       <w:r>
         <w:rPr>
           <w:b/>
         </w:rPr>
         <w:t>S2C - AI Sketch-to-Design Learning Project</w:t>
+      </w:r>
+      <w:r>
+        <w:tab/>
+        <w:t>Live: https://ai-saa-s-sketch-to-design.vercel.app</w:t>
       </w:r>
     </w:p>
     <w:p>

</xml_diff>

<commit_message>
Add ShockProof project to portfolio and resume
</commit_message>
<xml_diff>
--- a/Saatvik_Raghuvanshi_Resume_ATS.docx
+++ b/Saatvik_Raghuvanshi_Resume_ATS.docx
@@ -275,6 +275,65 @@
         <w:rPr>
           <w:b/>
         </w:rPr>
+        <w:t>ShockProof - AI Smart Meter Tariff Guard</w:t>
+      </w:r>
+      <w:r>
+        <w:tab/>
+        <w:t>Live: https://shockproof.vercel.app</w:t>
+      </w:r>
+    </w:p>
+    <w:p>
+      <w:pPr>
+        <w:pStyle w:val="ResumeBullet"/>
+      </w:pPr>
+      <w:r>
+        <w:t>- Built an AI-powered smart meter tariff guard for Indian households using Next.js, React, TypeScript, Tailwind CSS, Supabase Auth/Database/Storage/Realtime, Gemini OCR, and Vercel.</w:t>
+      </w:r>
+    </w:p>
+    <w:p>
+      <w:pPr>
+        <w:pStyle w:val="ResumeBullet"/>
+      </w:pPr>
+      <w:r>
+        <w:t>- Implemented meter photo/video capture, secure Supabase Storage uploads, protected dashboard flows, reading history, manual correction fallback, and realtime status updates.</w:t>
+      </w:r>
+    </w:p>
+    <w:p>
+      <w:pPr>
+        <w:pStyle w:val="ResumeBullet"/>
+      </w:pPr>
+      <w:r>
+        <w:t>- Integrated Gemini OCR to extract cumulative kWh readings and generated projection-aware household advice based on current usage, month-end projections, tariff slab distance, estimated bill, and bill-risk level.</w:t>
+      </w:r>
+    </w:p>
+    <w:p>
+      <w:pPr>
+        <w:pStyle w:val="ResumeBullet"/>
+      </w:pPr>
+      <w:r>
+        <w:t>- Built for the INDIA.RUNS 2026 Ideathon, Challenge 3: Improve Everyday Life with AI, as part of team Noble Dawn.</w:t>
+      </w:r>
+    </w:p>
+    <w:p>
+      <w:pPr>
+        <w:pStyle w:val="ResumeBullet"/>
+      </w:pPr>
+      <w:r>
+        <w:t>- GitHub: https://github.com/saatvikraghuvanshi-lab/ShockProof</w:t>
+      </w:r>
+    </w:p>
+    <w:p>
+      <w:pPr>
+        <w:pStyle w:val="ResumeRole"/>
+        <w:keepNext/>
+        <w:tabs>
+          <w:tab w:pos="9648" w:val="right"/>
+        </w:tabs>
+      </w:pPr>
+      <w:r>
+        <w:rPr>
+          <w:b/>
+        </w:rPr>
         <w:t>S2C - AI Sketch-to-Design Learning Project</w:t>
       </w:r>
       <w:r>
@@ -534,6 +593,14 @@
       </w:pPr>
       <w:r>
         <w:t>ACHIEVEMENTS AND CERTIFICATIONS</w:t>
+      </w:r>
+    </w:p>
+    <w:p>
+      <w:pPr>
+        <w:pStyle w:val="ResumeBullet"/>
+      </w:pPr>
+      <w:r>
+        <w:t>- INDIA.RUNS 2026 Ideathon - Built ShockProof for Challenge 3: Improve Everyday Life with AI as part of team Noble Dawn.</w:t>
       </w:r>
     </w:p>
     <w:p>

</xml_diff>

<commit_message>
Refine portfolio theme and project details
</commit_message>
<xml_diff>
--- a/Saatvik_Raghuvanshi_Resume_ATS.docx
+++ b/Saatvik_Raghuvanshi_Resume_ATS.docx
@@ -2,6 +2,21 @@
 <file path=word/document.xml><?xml version="1.0" encoding="utf-8"?>
 <w:document xmlns:wpc="http://schemas.microsoft.com/office/word/2010/wordprocessingCanvas" xmlns:mo="http://schemas.microsoft.com/office/mac/office/2008/main" xmlns:mc="http://schemas.openxmlformats.org/markup-compatibility/2006" xmlns:mv="urn:schemas-microsoft-com:mac:vml" xmlns:o="urn:schemas-microsoft-com:office:office" xmlns:r="http://schemas.openxmlformats.org/officeDocument/2006/relationships" xmlns:m="http://schemas.openxmlformats.org/officeDocument/2006/math" xmlns:v="urn:schemas-microsoft-com:vml" xmlns:wp14="http://schemas.microsoft.com/office/word/2010/wordprocessingDrawing" xmlns:wp="http://schemas.openxmlformats.org/drawingml/2006/wordprocessingDrawing" xmlns:w10="urn:schemas-microsoft-com:office:word" xmlns:w="http://schemas.openxmlformats.org/wordprocessingml/2006/main" xmlns:w14="http://schemas.microsoft.com/office/word/2010/wordml" xmlns:wpg="http://schemas.microsoft.com/office/word/2010/wordprocessingGroup" xmlns:wpi="http://schemas.microsoft.com/office/word/2010/wordprocessingInk" xmlns:wne="http://schemas.microsoft.com/office/word/2006/wordml" xmlns:wps="http://schemas.microsoft.com/office/word/2010/wordprocessingShape" mc:Ignorable="w14 wp14">
   <w:body>
+    <w:p>
+      <w:pPr>
+        <w:spacing w:after="0"/>
+        <w:jc w:val="center"/>
+      </w:pPr>
+      <w:r>
+        <w:rPr>
+          <w:rFonts w:ascii="Arial" w:hAnsi="Arial" w:eastAsia="Arial"/>
+          <w:b/>
+          <w:color w:val="000000"/>
+          <w:sz w:val="31"/>
+        </w:rPr>
+        <w:t>SAATVIK RAGHUVANSHI</w:t>
+      </w:r>
+    </w:p>
     <w:p>
       <w:pPr>
         <w:spacing w:after="20"/>
@@ -10,10 +25,10 @@
       <w:r>
         <w:rPr>
           <w:rFonts w:ascii="Arial" w:hAnsi="Arial" w:eastAsia="Arial"/>
-          <w:b/>
-          <w:sz w:val="34"/>
+          <w:color w:val="000000"/>
+          <w:sz w:val="16"/>
         </w:rPr>
-        <w:t>SAATVIK RAGHUVANSHI</w:t>
+        <w:t>B.Tech CSE Student | Full-Stack Developer | Cloud Engineering Aspirant</w:t>
       </w:r>
     </w:p>
     <w:p>
@@ -22,48 +37,73 @@
         <w:jc w:val="center"/>
       </w:pPr>
       <w:r>
-        <w:t>B.Tech CSE Student | Full-Stack Developer | Cloud Engineering Aspirant</w:t>
-      </w:r>
-    </w:p>
-    <w:p>
-      <w:pPr>
-        <w:jc w:val="center"/>
-      </w:pPr>
-      <w:r>
+        <w:rPr>
+          <w:rFonts w:ascii="Arial" w:hAnsi="Arial" w:eastAsia="Arial"/>
+          <w:color w:val="000000"/>
+          <w:sz w:val="16"/>
+        </w:rPr>
         <w:t>Jaipur, Rajasthan, India</w:t>
       </w:r>
       <w:r>
+        <w:rPr>
+          <w:rFonts w:ascii="Arial" w:hAnsi="Arial" w:eastAsia="Arial"/>
+          <w:color w:val="000000"/>
+          <w:sz w:val="16"/>
+        </w:rPr>
         <w:t xml:space="preserve"> | </w:t>
       </w:r>
       <w:r>
-        <w:t>9301661150</w:t>
+        <w:rPr>
+          <w:rFonts w:ascii="Arial" w:hAnsi="Arial" w:eastAsia="Arial"/>
+          <w:color w:val="000000"/>
+          <w:sz w:val="16"/>
+        </w:rPr>
+        <w:t>+91 9301661150</w:t>
       </w:r>
       <w:r>
-        <w:t xml:space="preserve"> | </w:t>
-      </w:r>
-      <w:r>
-        <w:t>raghuvanshisaatvik@gmail.com</w:t>
-      </w:r>
-      <w:r>
+        <w:rPr>
+          <w:rFonts w:ascii="Arial" w:hAnsi="Arial" w:eastAsia="Arial"/>
+          <w:color w:val="000000"/>
+          <w:sz w:val="16"/>
+        </w:rPr>
         <w:t xml:space="preserve"> | </w:t>
       </w:r>
       <w:hyperlink r:id="rId9">
         <w:r>
           <w:rPr>
-            <w:color w:val="0563C1"/>
-            <w:u w:val="single"/>
+            <w:color w:val="000000"/>
+          </w:rPr>
+          <w:t>raghuvanshisaatvik@gmail.com</w:t>
+        </w:r>
+      </w:hyperlink>
+      <w:r>
+        <w:rPr>
+          <w:rFonts w:ascii="Arial" w:hAnsi="Arial" w:eastAsia="Arial"/>
+          <w:color w:val="000000"/>
+          <w:sz w:val="16"/>
+        </w:rPr>
+        <w:t xml:space="preserve"> | </w:t>
+      </w:r>
+      <w:hyperlink r:id="rId10">
+        <w:r>
+          <w:rPr>
+            <w:color w:val="000000"/>
           </w:rPr>
           <w:t>linkedin.com/in/saatvik-raghuvanshi</w:t>
         </w:r>
       </w:hyperlink>
       <w:r>
+        <w:rPr>
+          <w:rFonts w:ascii="Arial" w:hAnsi="Arial" w:eastAsia="Arial"/>
+          <w:color w:val="000000"/>
+          <w:sz w:val="16"/>
+        </w:rPr>
         <w:t xml:space="preserve"> | </w:t>
       </w:r>
-      <w:hyperlink r:id="rId10">
+      <w:hyperlink r:id="rId11">
         <w:r>
           <w:rPr>
-            <w:color w:val="0563C1"/>
-            <w:u w:val="single"/>
+            <w:color w:val="000000"/>
           </w:rPr>
           <w:t>github.com/saatvikraghuvanshi-lab</w:t>
         </w:r>
@@ -71,44 +111,158 @@
     </w:p>
     <w:p>
       <w:pPr>
-        <w:spacing w:before="80"/>
-        <w:pBdr>
-          <w:bottom w:val="single" w:sz="6" w:space="1" w:color="000000"/>
-        </w:pBdr>
-      </w:pPr>
-    </w:p>
-    <w:p>
-      <w:pPr>
         <w:pStyle w:val="ResumeHeading"/>
         <w:keepNext/>
+        <w:pBdr>
+          <w:bottom w:val="single" w:sz="4" w:space="1" w:color="000000"/>
+        </w:pBdr>
       </w:pPr>
       <w:r>
         <w:t>SUMMARY</w:t>
       </w:r>
     </w:p>
     <w:p>
+      <w:pPr>
+        <w:spacing w:after="24"/>
+      </w:pPr>
       <w:r>
-        <w:t>B.Tech Computer Science student with hands-on experience building full-stack web applications, frontend interfaces, database-backed projects, AI-assisted workflows, and deployed portfolio projects. Experienced with React, Next.js, TypeScript, Supabase, PostgreSQL, Convex, Tailwind CSS, Git, GitHub, and Vercel through hackathons, ideathons, freelance work, and project-based learning.</w:t>
+        <w:rPr>
+          <w:rFonts w:ascii="Arial" w:hAnsi="Arial" w:eastAsia="Arial"/>
+          <w:color w:val="000000"/>
+          <w:sz w:val="16"/>
+        </w:rPr>
+        <w:t>Computer Science undergraduate at Manipal University Jaipur with hands-on experience building deployed full-stack web applications, AI-assisted workflows, Supabase/PostgreSQL backends, and frontend-focused product interfaces. Comfortable working across React, Next.js, TypeScript, Tailwind CSS, authentication, database design, cloud deployment, and practical UI/UX through hackathons, ideathons, freelance work, and project-based learning.</w:t>
       </w:r>
     </w:p>
     <w:p>
       <w:pPr>
         <w:pStyle w:val="ResumeHeading"/>
         <w:keepNext/>
+        <w:pBdr>
+          <w:bottom w:val="single" w:sz="4" w:space="1" w:color="000000"/>
+        </w:pBdr>
       </w:pPr>
       <w:r>
-        <w:t>TARGET ROLES</w:t>
+        <w:t>TECHNICAL SKILLS</w:t>
       </w:r>
     </w:p>
     <w:p>
+      <w:pPr>
+        <w:pStyle w:val="ResumePair"/>
+      </w:pPr>
       <w:r>
-        <w:t>Cloud Engineer Intern, Full-Stack Developer Intern, Frontend Developer Intern, Web Developer Intern, Software Engineering Intern, Freelance Web Developer</w:t>
+        <w:rPr>
+          <w:rFonts w:ascii="Arial" w:hAnsi="Arial" w:eastAsia="Arial"/>
+          <w:b/>
+          <w:color w:val="000000"/>
+          <w:sz w:val="15"/>
+        </w:rPr>
+        <w:t xml:space="preserve">Languages: </w:t>
+      </w:r>
+      <w:r>
+        <w:rPr>
+          <w:rFonts w:ascii="Arial" w:hAnsi="Arial" w:eastAsia="Arial"/>
+          <w:color w:val="000000"/>
+          <w:sz w:val="15"/>
+        </w:rPr>
+        <w:t>C, Python, TypeScript, JavaScript, HTML, CSS</w:t>
+      </w:r>
+    </w:p>
+    <w:p>
+      <w:pPr>
+        <w:pStyle w:val="ResumePair"/>
+      </w:pPr>
+      <w:r>
+        <w:rPr>
+          <w:rFonts w:ascii="Arial" w:hAnsi="Arial" w:eastAsia="Arial"/>
+          <w:b/>
+          <w:color w:val="000000"/>
+          <w:sz w:val="15"/>
+        </w:rPr>
+        <w:t xml:space="preserve">Frontend: </w:t>
+      </w:r>
+      <w:r>
+        <w:rPr>
+          <w:rFonts w:ascii="Arial" w:hAnsi="Arial" w:eastAsia="Arial"/>
+          <w:color w:val="000000"/>
+          <w:sz w:val="15"/>
+        </w:rPr>
+        <w:t>React.js, Next.js, Tailwind CSS, shadcn/ui, Radix UI, Redux, responsive UI/UX</w:t>
+      </w:r>
+    </w:p>
+    <w:p>
+      <w:pPr>
+        <w:pStyle w:val="ResumePair"/>
+      </w:pPr>
+      <w:r>
+        <w:rPr>
+          <w:rFonts w:ascii="Arial" w:hAnsi="Arial" w:eastAsia="Arial"/>
+          <w:b/>
+          <w:color w:val="000000"/>
+          <w:sz w:val="15"/>
+        </w:rPr>
+        <w:t xml:space="preserve">Backend and Database: </w:t>
+      </w:r>
+      <w:r>
+        <w:rPr>
+          <w:rFonts w:ascii="Arial" w:hAnsi="Arial" w:eastAsia="Arial"/>
+          <w:color w:val="000000"/>
+          <w:sz w:val="15"/>
+        </w:rPr>
+        <w:t>Node.js, PostgreSQL, Supabase, Convex, REST APIs, authentication, Row Level Security</w:t>
+      </w:r>
+    </w:p>
+    <w:p>
+      <w:pPr>
+        <w:pStyle w:val="ResumePair"/>
+      </w:pPr>
+      <w:r>
+        <w:rPr>
+          <w:rFonts w:ascii="Arial" w:hAnsi="Arial" w:eastAsia="Arial"/>
+          <w:b/>
+          <w:color w:val="000000"/>
+          <w:sz w:val="15"/>
+        </w:rPr>
+        <w:t xml:space="preserve">AI, Cloud and Tools: </w:t>
+      </w:r>
+      <w:r>
+        <w:rPr>
+          <w:rFonts w:ascii="Arial" w:hAnsi="Arial" w:eastAsia="Arial"/>
+          <w:color w:val="000000"/>
+          <w:sz w:val="15"/>
+        </w:rPr>
+        <w:t>Gemini API, Inngest, Firebase, Google Cloud, Vercel, Netlify, Git, GitHub, ngrok</w:t>
+      </w:r>
+    </w:p>
+    <w:p>
+      <w:pPr>
+        <w:pStyle w:val="ResumePair"/>
+      </w:pPr>
+      <w:r>
+        <w:rPr>
+          <w:rFonts w:ascii="Arial" w:hAnsi="Arial" w:eastAsia="Arial"/>
+          <w:b/>
+          <w:color w:val="000000"/>
+          <w:sz w:val="15"/>
+        </w:rPr>
+        <w:t xml:space="preserve">Other Technical Skills: </w:t>
+      </w:r>
+      <w:r>
+        <w:rPr>
+          <w:rFonts w:ascii="Arial" w:hAnsi="Arial" w:eastAsia="Arial"/>
+          <w:color w:val="000000"/>
+          <w:sz w:val="15"/>
+        </w:rPr>
+        <w:t>AutoCAD, drone building, line follower robots, GIS map integration, robotics fundamentals</w:t>
       </w:r>
     </w:p>
     <w:p>
       <w:pPr>
         <w:pStyle w:val="ResumeHeading"/>
         <w:keepNext/>
+        <w:pBdr>
+          <w:bottom w:val="single" w:sz="4" w:space="1" w:color="000000"/>
+        </w:pBdr>
       </w:pPr>
       <w:r>
         <w:t>EDUCATION</w:t>
@@ -118,19 +272,23 @@
       <w:pPr>
         <w:pStyle w:val="ResumeRole"/>
         <w:keepNext/>
-        <w:tabs>
-          <w:tab w:pos="9648" w:val="right"/>
-        </w:tabs>
       </w:pPr>
       <w:r>
         <w:rPr>
+          <w:rFonts w:ascii="Arial" w:hAnsi="Arial" w:eastAsia="Arial"/>
           <w:b/>
+          <w:color w:val="000000"/>
+          <w:sz w:val="16"/>
         </w:rPr>
         <w:t>Manipal University Jaipur - B.Tech in Computer Science and Engineering</w:t>
       </w:r>
       <w:r>
-        <w:tab/>
-        <w:t>Expected 2029</w:t>
+        <w:rPr>
+          <w:rFonts w:ascii="Arial" w:hAnsi="Arial" w:eastAsia="Arial"/>
+          <w:color w:val="000000"/>
+          <w:sz w:val="15"/>
+        </w:rPr>
+        <w:t xml:space="preserve"> | Expected 2029 | Current GPA: 7.0</w:t>
       </w:r>
     </w:p>
     <w:p>
@@ -138,7 +296,12 @@
         <w:pStyle w:val="ResumeBullet"/>
       </w:pPr>
       <w:r>
-        <w:t>- Current GPA: 7.0; completed first year coursework while building practical projects in full-stack development, APIs, UI/UX, databases, and cloud-related tools.</w:t>
+        <w:rPr>
+          <w:rFonts w:ascii="Arial" w:hAnsi="Arial" w:eastAsia="Arial"/>
+          <w:color w:val="000000"/>
+          <w:sz w:val="15"/>
+        </w:rPr>
+        <w:t>- Completed first year while building practical projects across web development, APIs, databases, AI workflows, UI/UX, and cloud-related tools.</w:t>
       </w:r>
     </w:p>
     <w:p>
@@ -148,7 +311,10 @@
       </w:pPr>
       <w:r>
         <w:rPr>
+          <w:rFonts w:ascii="Arial" w:hAnsi="Arial" w:eastAsia="Arial"/>
           <w:b/>
+          <w:color w:val="000000"/>
+          <w:sz w:val="16"/>
         </w:rPr>
         <w:t>Army Public School - Class 10: 86% | Resonance - Class 12: 82%</w:t>
       </w:r>
@@ -158,106 +324,21 @@
         <w:pStyle w:val="ResumeBullet"/>
       </w:pPr>
       <w:r>
-        <w:t>- Academic background supported by early exposure to robotics, drone building, line follower systems, and technical workshops.</w:t>
+        <w:rPr>
+          <w:rFonts w:ascii="Arial" w:hAnsi="Arial" w:eastAsia="Arial"/>
+          <w:color w:val="000000"/>
+          <w:sz w:val="15"/>
+        </w:rPr>
+        <w:t>- Built early technical exposure through robotics, drone building, line follower systems, and technical workshops.</w:t>
       </w:r>
     </w:p>
     <w:p>
       <w:pPr>
         <w:pStyle w:val="ResumeHeading"/>
         <w:keepNext/>
-      </w:pPr>
-      <w:r>
-        <w:t>TECHNICAL SKILLS</w:t>
-      </w:r>
-    </w:p>
-    <w:p>
-      <w:pPr>
-        <w:spacing w:after="20"/>
-      </w:pPr>
-      <w:r>
-        <w:rPr>
-          <w:b/>
-        </w:rPr>
-        <w:t xml:space="preserve">Languages: </w:t>
-      </w:r>
-      <w:r>
-        <w:t>C, Python, TypeScript, HTML</w:t>
-      </w:r>
-    </w:p>
-    <w:p>
-      <w:pPr>
-        <w:spacing w:after="20"/>
-      </w:pPr>
-      <w:r>
-        <w:rPr>
-          <w:b/>
-        </w:rPr>
-        <w:t xml:space="preserve">Frontend: </w:t>
-      </w:r>
-      <w:r>
-        <w:t>React.js, Next.js, TypeScript, JavaScript, Redux, Tailwind CSS, shadcn/ui, Radix UI, HTML, CSS, responsive web design, UI/UX</w:t>
-      </w:r>
-    </w:p>
-    <w:p>
-      <w:pPr>
-        <w:spacing w:after="20"/>
-      </w:pPr>
-      <w:r>
-        <w:rPr>
-          <w:b/>
-        </w:rPr>
-        <w:t xml:space="preserve">Backend and Database: </w:t>
-      </w:r>
-      <w:r>
-        <w:t>Node.js, PostgreSQL, Supabase, Convex, Convex Auth, Convex Storage, relational data modeling, Row Level Security (RLS), REST APIs, authentication</w:t>
-      </w:r>
-    </w:p>
-    <w:p>
-      <w:pPr>
-        <w:spacing w:after="20"/>
-      </w:pPr>
-      <w:r>
-        <w:rPr>
-          <w:b/>
-        </w:rPr>
-        <w:t xml:space="preserve">Cloud, AI, and Workflows: </w:t>
-      </w:r>
-      <w:r>
-        <w:t>Google Cloud, Firebase, Gemini API, Inngest, cloud computing training, AI prompting, background jobs, deployment workflows</w:t>
-      </w:r>
-    </w:p>
-    <w:p>
-      <w:pPr>
-        <w:spacing w:after="20"/>
-      </w:pPr>
-      <w:r>
-        <w:rPr>
-          <w:b/>
-        </w:rPr>
-        <w:t xml:space="preserve">Developer Tools: </w:t>
-      </w:r>
-      <w:r>
-        <w:t>Git, GitHub, GitHub Docs, Vercel, Netlify, ngrok, Google Stitch, OpenAI Codex</w:t>
-      </w:r>
-    </w:p>
-    <w:p>
-      <w:pPr>
-        <w:spacing w:after="20"/>
-      </w:pPr>
-      <w:r>
-        <w:rPr>
-          <w:b/>
-        </w:rPr>
-        <w:t xml:space="preserve">Additional Technical Skills: </w:t>
-      </w:r>
-      <w:r>
-        <w:t>AutoCAD, drone building, line follower robots, GIS map integration, robotics fundamentals, analytical problem solving</w:t>
-      </w:r>
-    </w:p>
-    <w:p>
-      <w:pPr>
-        <w:pStyle w:val="ResumeHeading"/>
-        <w:keepNext/>
+        <w:pBdr>
+          <w:bottom w:val="single" w:sz="4" w:space="1" w:color="000000"/>
+        </w:pBdr>
       </w:pPr>
       <w:r>
         <w:t>PROJECTS</w:t>
@@ -267,19 +348,23 @@
       <w:pPr>
         <w:pStyle w:val="ResumeRole"/>
         <w:keepNext/>
-        <w:tabs>
-          <w:tab w:pos="9648" w:val="right"/>
-        </w:tabs>
       </w:pPr>
       <w:r>
         <w:rPr>
+          <w:rFonts w:ascii="Arial" w:hAnsi="Arial" w:eastAsia="Arial"/>
           <w:b/>
+          <w:color w:val="000000"/>
+          <w:sz w:val="16"/>
         </w:rPr>
         <w:t>ShockProof - AI Smart Meter Tariff Guard</w:t>
       </w:r>
       <w:r>
-        <w:tab/>
-        <w:t>Live: https://shockproof.vercel.app</w:t>
+        <w:rPr>
+          <w:rFonts w:ascii="Arial" w:hAnsi="Arial" w:eastAsia="Arial"/>
+          <w:color w:val="000000"/>
+          <w:sz w:val="15"/>
+        </w:rPr>
+        <w:t xml:space="preserve"> | Live: https://shockproof.vercel.app | GitHub: github.com/saatvikraghuvanshi-lab/ShockProof</w:t>
       </w:r>
     </w:p>
     <w:p>
@@ -287,7 +372,12 @@
         <w:pStyle w:val="ResumeBullet"/>
       </w:pPr>
       <w:r>
-        <w:t>- Built an AI-powered smart meter tariff guard for Indian households using Next.js, React, TypeScript, Tailwind CSS, Supabase Auth/Database/Storage/Realtime, Gemini OCR, and Vercel.</w:t>
+        <w:rPr>
+          <w:rFonts w:ascii="Arial" w:hAnsi="Arial" w:eastAsia="Arial"/>
+          <w:color w:val="000000"/>
+          <w:sz w:val="15"/>
+        </w:rPr>
+        <w:t>- Built an AI-powered electricity meter assistant for Indian households using Next.js, React, TypeScript, Tailwind CSS, Supabase Auth/Database/Storage/Realtime, Gemini OCR, and Vercel.</w:t>
       </w:r>
     </w:p>
     <w:p>
@@ -295,7 +385,35 @@
         <w:pStyle w:val="ResumeBullet"/>
       </w:pPr>
       <w:r>
-        <w:t>- Implemented meter photo/video capture, secure Supabase Storage uploads, protected dashboard flows, reading history, manual correction fallback, and realtime status updates.</w:t>
+        <w:rPr>
+          <w:rFonts w:ascii="Arial" w:hAnsi="Arial" w:eastAsia="Arial"/>
+          <w:color w:val="000000"/>
+          <w:sz w:val="15"/>
+        </w:rPr>
+        <w:t>- Implemented secure meter photo/video uploads, reading history, manual correction fallback, kWh extraction, month-end usage projection, tariff slab distance, estimated bill, bill-risk level, and Gemini-generated household advice.</w:t>
+      </w:r>
+    </w:p>
+    <w:p>
+      <w:pPr>
+        <w:pStyle w:val="ResumeRole"/>
+        <w:keepNext/>
+      </w:pPr>
+      <w:r>
+        <w:rPr>
+          <w:rFonts w:ascii="Arial" w:hAnsi="Arial" w:eastAsia="Arial"/>
+          <w:b/>
+          <w:color w:val="000000"/>
+          <w:sz w:val="16"/>
+        </w:rPr>
+        <w:t>S2C - AI Sketch-to-Design Learning Project</w:t>
+      </w:r>
+      <w:r>
+        <w:rPr>
+          <w:rFonts w:ascii="Arial" w:hAnsi="Arial" w:eastAsia="Arial"/>
+          <w:color w:val="000000"/>
+          <w:sz w:val="15"/>
+        </w:rPr>
+        <w:t xml:space="preserve"> | Live: https://ai-saa-s-sketch-to-design.vercel.app | GitHub: github.com/saatvikraghuvanshi-lab/Ai-SaaS-Sketch-To-Design</w:t>
       </w:r>
     </w:p>
     <w:p>
@@ -303,7 +421,35 @@
         <w:pStyle w:val="ResumeBullet"/>
       </w:pPr>
       <w:r>
-        <w:t>- Integrated Gemini OCR to extract cumulative kWh readings and generated projection-aware household advice based on current usage, month-end projections, tariff slab distance, estimated bill, and bill-risk level.</w:t>
+        <w:rPr>
+          <w:rFonts w:ascii="Arial" w:hAnsi="Arial" w:eastAsia="Arial"/>
+          <w:color w:val="000000"/>
+          <w:sz w:val="15"/>
+        </w:rPr>
+        <w:t>- Built a full-stack AI SaaS-style design tool with Google auth, project dashboard, infinite canvas editor, Redux canvas state, Convex database/auth/storage, Inngest autosave, Gemini API routes, PNG exports, and JSON exports.</w:t>
+      </w:r>
+    </w:p>
+    <w:p>
+      <w:pPr>
+        <w:pStyle w:val="ResumeRole"/>
+        <w:keepNext/>
+      </w:pPr>
+      <w:r>
+        <w:rPr>
+          <w:rFonts w:ascii="Arial" w:hAnsi="Arial" w:eastAsia="Arial"/>
+          <w:b/>
+          <w:color w:val="000000"/>
+          <w:sz w:val="16"/>
+        </w:rPr>
+        <w:t>VibeBatch - Social Personality Web Application</w:t>
+      </w:r>
+      <w:r>
+        <w:rPr>
+          <w:rFonts w:ascii="Arial" w:hAnsi="Arial" w:eastAsia="Arial"/>
+          <w:color w:val="000000"/>
+          <w:sz w:val="15"/>
+        </w:rPr>
+        <w:t xml:space="preserve"> | Live: https://www.vibebatch.net | GitHub: github.com/saatvikraghuvanshi-lab/VibeBatch</w:t>
       </w:r>
     </w:p>
     <w:p>
@@ -311,7 +457,35 @@
         <w:pStyle w:val="ResumeBullet"/>
       </w:pPr>
       <w:r>
-        <w:t>- Built for the INDIA.RUNS 2026 Ideathon, Challenge 3: Improve Everyday Life with AI, as part of team Noble Dawn.</w:t>
+        <w:rPr>
+          <w:rFonts w:ascii="Arial" w:hAnsi="Arial" w:eastAsia="Arial"/>
+          <w:color w:val="000000"/>
+          <w:sz w:val="15"/>
+        </w:rPr>
+        <w:t>- Architected Supabase/PostgreSQL data flows for user profiles, friend relationships, anonymous trait voting, messages, invite sharing, premium identity cards, Gemini help support, and Row Level Security-based privacy.</w:t>
+      </w:r>
+    </w:p>
+    <w:p>
+      <w:pPr>
+        <w:pStyle w:val="ResumeRole"/>
+        <w:keepNext/>
+      </w:pPr>
+      <w:r>
+        <w:rPr>
+          <w:rFonts w:ascii="Arial" w:hAnsi="Arial" w:eastAsia="Arial"/>
+          <w:b/>
+          <w:color w:val="000000"/>
+          <w:sz w:val="16"/>
+        </w:rPr>
+        <w:t>ResilienceOS - Disaster Management Web Platform</w:t>
+      </w:r>
+      <w:r>
+        <w:rPr>
+          <w:rFonts w:ascii="Arial" w:hAnsi="Arial" w:eastAsia="Arial"/>
+          <w:color w:val="000000"/>
+          <w:sz w:val="15"/>
+        </w:rPr>
+        <w:t xml:space="preserve"> | Live: https://resilienceos.vercel.app | GitHub: github.com/saatvikraghuvanshi-lab/RESILIENCEOS</w:t>
       </w:r>
     </w:p>
     <w:p>
@@ -319,26 +493,35 @@
         <w:pStyle w:val="ResumeBullet"/>
       </w:pPr>
       <w:r>
-        <w:t>- GitHub: https://github.com/saatvikraghuvanshi-lab/ShockProof</w:t>
+        <w:rPr>
+          <w:rFonts w:ascii="Arial" w:hAnsi="Arial" w:eastAsia="Arial"/>
+          <w:color w:val="000000"/>
+          <w:sz w:val="15"/>
+        </w:rPr>
+        <w:t>- Built role-based disaster-response workflows for admin command, responder tasks, civilian SOS reporting, map simulation, readiness training, strategic forecasting, and report generation; recognized as a 4th place Startup Forge Ideathon project.</w:t>
       </w:r>
     </w:p>
     <w:p>
       <w:pPr>
         <w:pStyle w:val="ResumeRole"/>
         <w:keepNext/>
-        <w:tabs>
-          <w:tab w:pos="9648" w:val="right"/>
-        </w:tabs>
       </w:pPr>
       <w:r>
         <w:rPr>
+          <w:rFonts w:ascii="Arial" w:hAnsi="Arial" w:eastAsia="Arial"/>
           <w:b/>
+          <w:color w:val="000000"/>
+          <w:sz w:val="16"/>
         </w:rPr>
-        <w:t>S2C - AI Sketch-to-Design Learning Project</w:t>
+        <w:t>JanSahayak - AI Public Assistance Web Application</w:t>
       </w:r>
       <w:r>
-        <w:tab/>
-        <w:t>Live: https://ai-saa-s-sketch-to-design.vercel.app</w:t>
+        <w:rPr>
+          <w:rFonts w:ascii="Arial" w:hAnsi="Arial" w:eastAsia="Arial"/>
+          <w:color w:val="000000"/>
+          <w:sz w:val="15"/>
+        </w:rPr>
+        <w:t xml:space="preserve"> | Live: https://jansahayak1.netlify.app</w:t>
       </w:r>
     </w:p>
     <w:p>
@@ -346,201 +529,21 @@
         <w:pStyle w:val="ResumeBullet"/>
       </w:pPr>
       <w:r>
-        <w:t>- Built a full-stack AI SaaS-style design tool using Next.js, React, TypeScript, Convex, Inngest, Redux, Tailwind CSS, shadcn/ui, Radix UI, and Gemini API, covering authentication, projects, infinite canvas editing, autosave, and PNG/JSON exports.</w:t>
-      </w:r>
-    </w:p>
-    <w:p>
-      <w:pPr>
-        <w:pStyle w:val="ResumeBullet"/>
-      </w:pPr>
-      <w:r>
-        <w:t>- Implemented canvas tools including frames, shapes, text, free drawing, eraser, layers, selection, zoom, pan, and generated UI rendering.</w:t>
-      </w:r>
-    </w:p>
-    <w:p>
-      <w:pPr>
-        <w:pStyle w:val="ResumeBullet"/>
-      </w:pPr>
-      <w:r>
-        <w:t>- Integrated Convex database, Convex Auth, Convex Storage, Inngest, and Gemini-compatible API routes for database operations, authentication, file storage, background jobs, and AI workflow orchestration.</w:t>
-      </w:r>
-    </w:p>
-    <w:p>
-      <w:pPr>
-        <w:pStyle w:val="ResumeBullet"/>
-      </w:pPr>
-      <w:r>
-        <w:t>- GitHub: https://github.com/saatvikraghuvanshi-lab/Ai-SaaS-Sketch-To-Design</w:t>
-      </w:r>
-    </w:p>
-    <w:p>
-      <w:pPr>
-        <w:pStyle w:val="ResumeRole"/>
-        <w:keepNext/>
-        <w:tabs>
-          <w:tab w:pos="9648" w:val="right"/>
-        </w:tabs>
-      </w:pPr>
-      <w:r>
         <w:rPr>
-          <w:b/>
+          <w:rFonts w:ascii="Arial" w:hAnsi="Arial" w:eastAsia="Arial"/>
+          <w:color w:val="000000"/>
+          <w:sz w:val="15"/>
         </w:rPr>
-        <w:t>VibeBatch - Full-Stack Web Application</w:t>
-      </w:r>
-      <w:r>
-        <w:tab/>
-        <w:t>Live: https://www.vibebatch.net/</w:t>
-      </w:r>
-    </w:p>
-    <w:p>
-      <w:pPr>
-        <w:pStyle w:val="ResumeBullet"/>
-      </w:pPr>
-      <w:r>
-        <w:t>- Architected relational PostgreSQL schemas in Supabase to support user profiles, friend relationships, trait voting, messages, story cards, and premium identity flows.</w:t>
-      </w:r>
-    </w:p>
-    <w:p>
-      <w:pPr>
-        <w:pStyle w:val="ResumeBullet"/>
-      </w:pPr>
-      <w:r>
-        <w:t>- Engineered data privacy and security patterns using Supabase Row Level Security (RLS) for user-owned profile, relationship, message, and trait data.</w:t>
-      </w:r>
-    </w:p>
-    <w:p>
-      <w:pPr>
-        <w:pStyle w:val="ResumeBullet"/>
-      </w:pPr>
-      <w:r>
-        <w:t>- Implemented secure user authentication and full-stack product workflows with a React/Vite frontend and Supabase Auth/database services.</w:t>
-      </w:r>
-    </w:p>
-    <w:p>
-      <w:pPr>
-        <w:pStyle w:val="ResumeBullet"/>
-      </w:pPr>
-      <w:r>
-        <w:t>- GitHub: https://github.com/saatvikraghuvanshi-lab/VibeBatch</w:t>
-      </w:r>
-    </w:p>
-    <w:p>
-      <w:pPr>
-        <w:pStyle w:val="ResumeRole"/>
-        <w:keepNext/>
-        <w:tabs>
-          <w:tab w:pos="9648" w:val="right"/>
-        </w:tabs>
-      </w:pPr>
-      <w:r>
-        <w:rPr>
-          <w:b/>
-        </w:rPr>
-        <w:t>ResilienceOS - Disaster Management Web Platform</w:t>
-      </w:r>
-      <w:r>
-        <w:tab/>
-        <w:t>Live: https://resilienceos.vercel.app/</w:t>
-      </w:r>
-    </w:p>
-    <w:p>
-      <w:pPr>
-        <w:pStyle w:val="ResumeBullet"/>
-      </w:pPr>
-      <w:r>
-        <w:t>- Built frontend and backend workflows for a unified disaster management system developed during Startup Forge Ideathon, including admin, responder, civilian, training, strategy, and report views.</w:t>
-      </w:r>
-    </w:p>
-    <w:p>
-      <w:pPr>
-        <w:pStyle w:val="ResumeBullet"/>
-      </w:pPr>
-      <w:r>
-        <w:t>- Modeled emergency-response data flows for map simulation, responder coordination, civilian SOS reporting, readiness training, and operational information access.</w:t>
-      </w:r>
-    </w:p>
-    <w:p>
-      <w:pPr>
-        <w:pStyle w:val="ResumeBullet"/>
-      </w:pPr>
-      <w:r>
-        <w:t>- GitHub: https://github.com/saatvikraghuvanshi-lab/RESILIENCEOS</w:t>
-      </w:r>
-    </w:p>
-    <w:p>
-      <w:pPr>
-        <w:pStyle w:val="ResumeRole"/>
-        <w:keepNext/>
-        <w:tabs>
-          <w:tab w:pos="9648" w:val="right"/>
-        </w:tabs>
-      </w:pPr>
-      <w:r>
-        <w:rPr>
-          <w:b/>
-        </w:rPr>
-        <w:t>JanSahayak - Public Assistance Web Application</w:t>
-      </w:r>
-      <w:r>
-        <w:tab/>
-        <w:t>Live: https://jansahayak1.netlify.app/</w:t>
-      </w:r>
-    </w:p>
-    <w:p>
-      <w:pPr>
-        <w:pStyle w:val="ResumeBullet"/>
-      </w:pPr>
-      <w:r>
-        <w:t>- Developed and deployed a civic-help oriented web application for a college Vibeathon, using AI-assisted workflows to support government-scheme discovery and eligibility guidance.</w:t>
-      </w:r>
-    </w:p>
-    <w:p>
-      <w:pPr>
-        <w:pStyle w:val="ResumeBullet"/>
-      </w:pPr>
-      <w:r>
-        <w:t>- Placed in the top 5 with a working prototype covering login, scheme discovery, filters, user dashboards, and an AI assistant flow.</w:t>
-      </w:r>
-    </w:p>
-    <w:p>
-      <w:pPr>
-        <w:pStyle w:val="ResumeRole"/>
-        <w:keepNext/>
-        <w:tabs>
-          <w:tab w:pos="9648" w:val="right"/>
-        </w:tabs>
-      </w:pPr>
-      <w:r>
-        <w:rPr>
-          <w:b/>
-        </w:rPr>
-        <w:t>TerraPulse Pro - GIS-Oriented Web Application</w:t>
-      </w:r>
-      <w:r>
-        <w:tab/>
-        <w:t>Live: https://terrapulsepro1.netlify.app/</w:t>
-      </w:r>
-    </w:p>
-    <w:p>
-      <w:pPr>
-        <w:pStyle w:val="ResumeBullet"/>
-      </w:pPr>
-      <w:r>
-        <w:t>- Built and deployed a GIS-oriented web application focused on map-based field visualization, satellite imagery views, NDVI-style analytics, and rural dashboard workflows.</w:t>
-      </w:r>
-    </w:p>
-    <w:p>
-      <w:pPr>
-        <w:pStyle w:val="ResumeBullet"/>
-      </w:pPr>
-      <w:r>
-        <w:t>- Strengthened experience in integrating geospatial data, map interfaces, technical metrics, and user-facing analytics into accessible web interfaces.</w:t>
+        <w:t>- Developed a civic-tech prototype for a college Vibeathon covering login, scheme discovery, filters, user dashboard, and AI assistant flow; placed in the top 5.</w:t>
       </w:r>
     </w:p>
     <w:p>
       <w:pPr>
         <w:pStyle w:val="ResumeHeading"/>
         <w:keepNext/>
+        <w:pBdr>
+          <w:bottom w:val="single" w:sz="4" w:space="1" w:color="000000"/>
+        </w:pBdr>
       </w:pPr>
       <w:r>
         <w:t>EXPERIENCE</w:t>
@@ -553,7 +556,10 @@
       </w:pPr>
       <w:r>
         <w:rPr>
+          <w:rFonts w:ascii="Arial" w:hAnsi="Arial" w:eastAsia="Arial"/>
           <w:b/>
+          <w:color w:val="000000"/>
+          <w:sz w:val="16"/>
         </w:rPr>
         <w:t>Freelance Full-Stack Developer - VibeBatch</w:t>
       </w:r>
@@ -563,7 +569,12 @@
         <w:pStyle w:val="ResumeBullet"/>
       </w:pPr>
       <w:r>
-        <w:t>- Delivered a live web product for a freelance project, handling full-stack development responsibilities, frontend implementation, database-backed workflows, and deployment readiness.</w:t>
+        <w:rPr>
+          <w:rFonts w:ascii="Arial" w:hAnsi="Arial" w:eastAsia="Arial"/>
+          <w:color w:val="000000"/>
+          <w:sz w:val="15"/>
+        </w:rPr>
+        <w:t>- Delivered a live freelance web product with frontend implementation, Supabase-backed workflows, authentication, database design, deployment readiness, and product UI refinement.</w:t>
       </w:r>
     </w:p>
     <w:p>
@@ -573,7 +584,10 @@
       </w:pPr>
       <w:r>
         <w:rPr>
+          <w:rFonts w:ascii="Arial" w:hAnsi="Arial" w:eastAsia="Arial"/>
           <w:b/>
+          <w:color w:val="000000"/>
+          <w:sz w:val="16"/>
         </w:rPr>
         <w:t>Cloud Computing Training - Training Phase</w:t>
       </w:r>
@@ -583,13 +597,21 @@
         <w:pStyle w:val="ResumeBullet"/>
       </w:pPr>
       <w:r>
-        <w:t>- Currently building foundational cloud computing knowledge aligned with cloud engineering internships, deployment workflows, backend services, and infrastructure fundamentals.</w:t>
+        <w:rPr>
+          <w:rFonts w:ascii="Arial" w:hAnsi="Arial" w:eastAsia="Arial"/>
+          <w:color w:val="000000"/>
+          <w:sz w:val="15"/>
+        </w:rPr>
+        <w:t>- Building foundational cloud computing knowledge aligned with cloud engineering internships, deployment workflows, backend services, and infrastructure fundamentals.</w:t>
       </w:r>
     </w:p>
     <w:p>
       <w:pPr>
         <w:pStyle w:val="ResumeHeading"/>
         <w:keepNext/>
+        <w:pBdr>
+          <w:bottom w:val="single" w:sz="4" w:space="1" w:color="000000"/>
+        </w:pBdr>
       </w:pPr>
       <w:r>
         <w:t>ACHIEVEMENTS AND CERTIFICATIONS</w:t>
@@ -600,7 +622,12 @@
         <w:pStyle w:val="ResumeBullet"/>
       </w:pPr>
       <w:r>
-        <w:t>- INDIA.RUNS 2026 Ideathon - Built ShockProof for Challenge 3: Improve Everyday Life with AI as part of team Noble Dawn.</w:t>
+        <w:rPr>
+          <w:rFonts w:ascii="Arial" w:hAnsi="Arial" w:eastAsia="Arial"/>
+          <w:color w:val="000000"/>
+          <w:sz w:val="15"/>
+        </w:rPr>
+        <w:t>- INDIA.RUNS 2026 Ideathon: Built ShockProof for Challenge 3, Improve Everyday Life with AI, as part of team Noble Dawn.</w:t>
       </w:r>
     </w:p>
     <w:p>
@@ -608,7 +635,12 @@
         <w:pStyle w:val="ResumeBullet"/>
       </w:pPr>
       <w:r>
-        <w:t>- Startup Forge Ideathon - 4th Place Finisher, GCEC Global Foundation; recognized for developing ResilienceOS during a 48-hour build.</w:t>
+        <w:rPr>
+          <w:rFonts w:ascii="Arial" w:hAnsi="Arial" w:eastAsia="Arial"/>
+          <w:color w:val="000000"/>
+          <w:sz w:val="15"/>
+        </w:rPr>
+        <w:t>- Startup Forge Ideathon: 4th Place Finisher, GCEC Global Foundation, for ResilienceOS during a 48-hour build.</w:t>
       </w:r>
     </w:p>
     <w:p>
@@ -616,20 +648,17 @@
         <w:pStyle w:val="ResumeBullet"/>
       </w:pPr>
       <w:r>
-        <w:t>- Career Guidance Session: Artificial Intelligence and Prompt Engineering - GradGuru Innovations.</w:t>
-      </w:r>
-    </w:p>
-    <w:p>
-      <w:pPr>
-        <w:pStyle w:val="ResumeBullet"/>
-      </w:pPr>
-      <w:r>
-        <w:t>- Technical workshops and hackathons: Rewind &amp; Recode National Hackathon, Robotics Workshop at Techfest IIT Bombay, WRC Quadcopter Challenge, Fastest Line Follower Challenge, and Machine Learning Workshop at Times Technoxian 2019.</w:t>
+        <w:rPr>
+          <w:rFonts w:ascii="Arial" w:hAnsi="Arial" w:eastAsia="Arial"/>
+          <w:color w:val="000000"/>
+          <w:sz w:val="15"/>
+        </w:rPr>
+        <w:t>- Technical workshops and hackathons: Rewind &amp; Recode National Hackathon, Robotics Workshop at Techfest IIT Bombay, WRC Quadcopter Challenge, Fastest Line Follower Challenge, Machine Learning Workshop, and AI/Prompt Engineering career session.</w:t>
       </w:r>
     </w:p>
     <w:sectPr>
       <w:pgSz w:w="12240" w:h="15840"/>
-      <w:pgMar w:top="792" w:right="936" w:bottom="792" w:left="936" w:header="720" w:footer="720" w:gutter="0"/>
+      <w:pgMar w:top="547" w:right="648" w:bottom="504" w:left="648" w:header="720" w:footer="720" w:gutter="0"/>
       <w:cols w:space="720"/>
       <w:docGrid w:linePitch="360"/>
     </w:sectPr>
@@ -1001,12 +1030,12 @@
     <w:qFormat/>
     <w:rsid w:val="00FC693F"/>
     <w:pPr>
-      <w:spacing w:after="60" w:line="259" w:lineRule="auto"/>
+      <w:spacing w:after="24" w:line="240" w:lineRule="auto"/>
     </w:pPr>
     <w:rPr>
       <w:rFonts w:ascii="Arial" w:hAnsi="Arial" w:eastAsia="Arial"/>
       <w:color w:val="000000"/>
-      <w:sz w:val="20"/>
+      <w:sz w:val="17"/>
     </w:rPr>
   </w:style>
   <w:style w:type="paragraph" w:styleId="Header">
@@ -12695,36 +12724,46 @@
     <w:name w:val="Resume Heading"/>
     <w:basedOn w:val="Normal"/>
     <w:pPr>
-      <w:spacing w:before="160" w:after="40" w:line="240" w:lineRule="auto"/>
+      <w:spacing w:before="84" w:after="24" w:line="240" w:lineRule="auto"/>
     </w:pPr>
     <w:rPr>
       <w:rFonts w:ascii="Arial" w:hAnsi="Arial" w:eastAsia="Arial"/>
       <w:b/>
-      <w:color w:val="000000"/>
-      <w:sz w:val="21"/>
+      <w:sz w:val="19"/>
     </w:rPr>
   </w:style>
   <w:style w:type="paragraph" w:customStyle="1" w:styleId="ResumeRole">
     <w:name w:val="Resume Role"/>
     <w:basedOn w:val="Normal"/>
     <w:pPr>
-      <w:spacing w:before="40" w:after="20" w:line="240" w:lineRule="auto"/>
+      <w:spacing w:before="28" w:after="8" w:line="240" w:lineRule="auto"/>
     </w:pPr>
     <w:rPr>
       <w:rFonts w:ascii="Arial" w:hAnsi="Arial" w:eastAsia="Arial"/>
-      <w:sz w:val="20"/>
+      <w:sz w:val="17"/>
     </w:rPr>
   </w:style>
   <w:style w:type="paragraph" w:customStyle="1" w:styleId="ResumeBullet">
     <w:name w:val="Resume Bullet"/>
     <w:basedOn w:val="Normal"/>
     <w:pPr>
-      <w:spacing w:after="40" w:line="250" w:lineRule="auto"/>
-      <w:ind w:left="259" w:hanging="259"/>
+      <w:spacing w:after="10" w:line="235" w:lineRule="auto"/>
+      <w:ind w:left="173" w:hanging="173"/>
     </w:pPr>
     <w:rPr>
       <w:rFonts w:ascii="Arial" w:hAnsi="Arial" w:eastAsia="Arial"/>
-      <w:sz w:val="19"/>
+      <w:sz w:val="16"/>
+    </w:rPr>
+  </w:style>
+  <w:style w:type="paragraph" w:customStyle="1" w:styleId="ResumePair">
+    <w:name w:val="Resume Pair"/>
+    <w:basedOn w:val="Normal"/>
+    <w:pPr>
+      <w:spacing w:after="12" w:line="235" w:lineRule="auto"/>
+    </w:pPr>
+    <w:rPr>
+      <w:rFonts w:ascii="Arial" w:hAnsi="Arial" w:eastAsia="Arial"/>
+      <w:sz w:val="16"/>
     </w:rPr>
   </w:style>
 </w:styles>

</xml_diff>

<commit_message>
Refine portfolio theme and resume layout
</commit_message>
<xml_diff>
--- a/Saatvik_Raghuvanshi_Resume_ATS.docx
+++ b/Saatvik_Raghuvanshi_Resume_ATS.docx
@@ -12,7 +12,7 @@
           <w:rFonts w:ascii="Arial" w:hAnsi="Arial" w:eastAsia="Arial"/>
           <w:b/>
           <w:color w:val="000000"/>
-          <w:sz w:val="31"/>
+          <w:sz w:val="32"/>
         </w:rPr>
         <w:t>SAATVIK RAGHUVANSHI</w:t>
       </w:r>
@@ -26,7 +26,7 @@
         <w:rPr>
           <w:rFonts w:ascii="Arial" w:hAnsi="Arial" w:eastAsia="Arial"/>
           <w:color w:val="000000"/>
-          <w:sz w:val="16"/>
+          <w:sz w:val="17"/>
         </w:rPr>
         <w:t>B.Tech CSE Student | Full-Stack Developer | Cloud Engineering Aspirant</w:t>
       </w:r>
@@ -123,13 +123,13 @@
     </w:p>
     <w:p>
       <w:pPr>
-        <w:spacing w:after="24"/>
+        <w:spacing w:after="27"/>
       </w:pPr>
       <w:r>
         <w:rPr>
           <w:rFonts w:ascii="Arial" w:hAnsi="Arial" w:eastAsia="Arial"/>
           <w:color w:val="000000"/>
-          <w:sz w:val="16"/>
+          <w:sz w:val="17"/>
         </w:rPr>
         <w:t>Computer Science undergraduate at Manipal University Jaipur with hands-on experience building deployed full-stack web applications, AI-assisted workflows, Supabase/PostgreSQL backends, and frontend-focused product interfaces. Comfortable working across React, Next.js, TypeScript, Tailwind CSS, authentication, database design, cloud deployment, and practical UI/UX through hackathons, ideathons, freelance work, and project-based learning.</w:t>
       </w:r>
@@ -155,7 +155,7 @@
           <w:rFonts w:ascii="Arial" w:hAnsi="Arial" w:eastAsia="Arial"/>
           <w:b/>
           <w:color w:val="000000"/>
-          <w:sz w:val="15"/>
+          <w:sz w:val="16"/>
         </w:rPr>
         <w:t xml:space="preserve">Languages: </w:t>
       </w:r>
@@ -163,7 +163,7 @@
         <w:rPr>
           <w:rFonts w:ascii="Arial" w:hAnsi="Arial" w:eastAsia="Arial"/>
           <w:color w:val="000000"/>
-          <w:sz w:val="15"/>
+          <w:sz w:val="16"/>
         </w:rPr>
         <w:t>C, Python, TypeScript, JavaScript, HTML, CSS</w:t>
       </w:r>
@@ -177,7 +177,7 @@
           <w:rFonts w:ascii="Arial" w:hAnsi="Arial" w:eastAsia="Arial"/>
           <w:b/>
           <w:color w:val="000000"/>
-          <w:sz w:val="15"/>
+          <w:sz w:val="16"/>
         </w:rPr>
         <w:t xml:space="preserve">Frontend: </w:t>
       </w:r>
@@ -185,7 +185,7 @@
         <w:rPr>
           <w:rFonts w:ascii="Arial" w:hAnsi="Arial" w:eastAsia="Arial"/>
           <w:color w:val="000000"/>
-          <w:sz w:val="15"/>
+          <w:sz w:val="16"/>
         </w:rPr>
         <w:t>React.js, Next.js, Tailwind CSS, shadcn/ui, Radix UI, Redux, responsive UI/UX</w:t>
       </w:r>
@@ -199,7 +199,7 @@
           <w:rFonts w:ascii="Arial" w:hAnsi="Arial" w:eastAsia="Arial"/>
           <w:b/>
           <w:color w:val="000000"/>
-          <w:sz w:val="15"/>
+          <w:sz w:val="16"/>
         </w:rPr>
         <w:t xml:space="preserve">Backend and Database: </w:t>
       </w:r>
@@ -207,7 +207,7 @@
         <w:rPr>
           <w:rFonts w:ascii="Arial" w:hAnsi="Arial" w:eastAsia="Arial"/>
           <w:color w:val="000000"/>
-          <w:sz w:val="15"/>
+          <w:sz w:val="16"/>
         </w:rPr>
         <w:t>Node.js, PostgreSQL, Supabase, Convex, REST APIs, authentication, Row Level Security</w:t>
       </w:r>
@@ -221,7 +221,7 @@
           <w:rFonts w:ascii="Arial" w:hAnsi="Arial" w:eastAsia="Arial"/>
           <w:b/>
           <w:color w:val="000000"/>
-          <w:sz w:val="15"/>
+          <w:sz w:val="16"/>
         </w:rPr>
         <w:t xml:space="preserve">AI, Cloud and Tools: </w:t>
       </w:r>
@@ -229,7 +229,7 @@
         <w:rPr>
           <w:rFonts w:ascii="Arial" w:hAnsi="Arial" w:eastAsia="Arial"/>
           <w:color w:val="000000"/>
-          <w:sz w:val="15"/>
+          <w:sz w:val="16"/>
         </w:rPr>
         <w:t>Gemini API, Inngest, Firebase, Google Cloud, Vercel, Netlify, Git, GitHub, ngrok</w:t>
       </w:r>
@@ -243,7 +243,7 @@
           <w:rFonts w:ascii="Arial" w:hAnsi="Arial" w:eastAsia="Arial"/>
           <w:b/>
           <w:color w:val="000000"/>
-          <w:sz w:val="15"/>
+          <w:sz w:val="16"/>
         </w:rPr>
         <w:t xml:space="preserve">Other Technical Skills: </w:t>
       </w:r>
@@ -251,7 +251,7 @@
         <w:rPr>
           <w:rFonts w:ascii="Arial" w:hAnsi="Arial" w:eastAsia="Arial"/>
           <w:color w:val="000000"/>
-          <w:sz w:val="15"/>
+          <w:sz w:val="16"/>
         </w:rPr>
         <w:t>AutoCAD, drone building, line follower robots, GIS map integration, robotics fundamentals</w:t>
       </w:r>
@@ -278,7 +278,7 @@
           <w:rFonts w:ascii="Arial" w:hAnsi="Arial" w:eastAsia="Arial"/>
           <w:b/>
           <w:color w:val="000000"/>
-          <w:sz w:val="16"/>
+          <w:sz w:val="17"/>
         </w:rPr>
         <w:t>Manipal University Jaipur - B.Tech in Computer Science and Engineering</w:t>
       </w:r>
@@ -286,7 +286,7 @@
         <w:rPr>
           <w:rFonts w:ascii="Arial" w:hAnsi="Arial" w:eastAsia="Arial"/>
           <w:color w:val="000000"/>
-          <w:sz w:val="15"/>
+          <w:sz w:val="16"/>
         </w:rPr>
         <w:t xml:space="preserve"> | Expected 2029 | Current GPA: 7.0</w:t>
       </w:r>
@@ -299,7 +299,7 @@
         <w:rPr>
           <w:rFonts w:ascii="Arial" w:hAnsi="Arial" w:eastAsia="Arial"/>
           <w:color w:val="000000"/>
-          <w:sz w:val="15"/>
+          <w:sz w:val="16"/>
         </w:rPr>
         <w:t>- Completed first year while building practical projects across web development, APIs, databases, AI workflows, UI/UX, and cloud-related tools.</w:t>
       </w:r>
@@ -314,7 +314,7 @@
           <w:rFonts w:ascii="Arial" w:hAnsi="Arial" w:eastAsia="Arial"/>
           <w:b/>
           <w:color w:val="000000"/>
-          <w:sz w:val="16"/>
+          <w:sz w:val="17"/>
         </w:rPr>
         <w:t>Army Public School - Class 10: 86% | Resonance - Class 12: 82%</w:t>
       </w:r>
@@ -327,7 +327,7 @@
         <w:rPr>
           <w:rFonts w:ascii="Arial" w:hAnsi="Arial" w:eastAsia="Arial"/>
           <w:color w:val="000000"/>
-          <w:sz w:val="15"/>
+          <w:sz w:val="16"/>
         </w:rPr>
         <w:t>- Built early technical exposure through robotics, drone building, line follower systems, and technical workshops.</w:t>
       </w:r>
@@ -354,7 +354,7 @@
           <w:rFonts w:ascii="Arial" w:hAnsi="Arial" w:eastAsia="Arial"/>
           <w:b/>
           <w:color w:val="000000"/>
-          <w:sz w:val="16"/>
+          <w:sz w:val="17"/>
         </w:rPr>
         <w:t>ShockProof - AI Smart Meter Tariff Guard</w:t>
       </w:r>
@@ -362,7 +362,7 @@
         <w:rPr>
           <w:rFonts w:ascii="Arial" w:hAnsi="Arial" w:eastAsia="Arial"/>
           <w:color w:val="000000"/>
-          <w:sz w:val="15"/>
+          <w:sz w:val="16"/>
         </w:rPr>
         <w:t xml:space="preserve"> | Live: https://shockproof.vercel.app | GitHub: github.com/saatvikraghuvanshi-lab/ShockProof</w:t>
       </w:r>
@@ -375,7 +375,7 @@
         <w:rPr>
           <w:rFonts w:ascii="Arial" w:hAnsi="Arial" w:eastAsia="Arial"/>
           <w:color w:val="000000"/>
-          <w:sz w:val="15"/>
+          <w:sz w:val="16"/>
         </w:rPr>
         <w:t>- Built an AI-powered electricity meter assistant for Indian households using Next.js, React, TypeScript, Tailwind CSS, Supabase Auth/Database/Storage/Realtime, Gemini OCR, and Vercel.</w:t>
       </w:r>
@@ -388,7 +388,7 @@
         <w:rPr>
           <w:rFonts w:ascii="Arial" w:hAnsi="Arial" w:eastAsia="Arial"/>
           <w:color w:val="000000"/>
-          <w:sz w:val="15"/>
+          <w:sz w:val="16"/>
         </w:rPr>
         <w:t>- Implemented secure meter photo/video uploads, reading history, manual correction fallback, kWh extraction, month-end usage projection, tariff slab distance, estimated bill, bill-risk level, and Gemini-generated household advice.</w:t>
       </w:r>
@@ -403,7 +403,7 @@
           <w:rFonts w:ascii="Arial" w:hAnsi="Arial" w:eastAsia="Arial"/>
           <w:b/>
           <w:color w:val="000000"/>
-          <w:sz w:val="16"/>
+          <w:sz w:val="17"/>
         </w:rPr>
         <w:t>S2C - AI Sketch-to-Design Learning Project</w:t>
       </w:r>
@@ -411,7 +411,7 @@
         <w:rPr>
           <w:rFonts w:ascii="Arial" w:hAnsi="Arial" w:eastAsia="Arial"/>
           <w:color w:val="000000"/>
-          <w:sz w:val="15"/>
+          <w:sz w:val="16"/>
         </w:rPr>
         <w:t xml:space="preserve"> | Live: https://ai-saa-s-sketch-to-design.vercel.app | GitHub: github.com/saatvikraghuvanshi-lab/Ai-SaaS-Sketch-To-Design</w:t>
       </w:r>
@@ -424,7 +424,7 @@
         <w:rPr>
           <w:rFonts w:ascii="Arial" w:hAnsi="Arial" w:eastAsia="Arial"/>
           <w:color w:val="000000"/>
-          <w:sz w:val="15"/>
+          <w:sz w:val="16"/>
         </w:rPr>
         <w:t>- Built a full-stack AI SaaS-style design tool with Google auth, project dashboard, infinite canvas editor, Redux canvas state, Convex database/auth/storage, Inngest autosave, Gemini API routes, PNG exports, and JSON exports.</w:t>
       </w:r>
@@ -439,7 +439,7 @@
           <w:rFonts w:ascii="Arial" w:hAnsi="Arial" w:eastAsia="Arial"/>
           <w:b/>
           <w:color w:val="000000"/>
-          <w:sz w:val="16"/>
+          <w:sz w:val="17"/>
         </w:rPr>
         <w:t>VibeBatch - Social Personality Web Application</w:t>
       </w:r>
@@ -447,7 +447,7 @@
         <w:rPr>
           <w:rFonts w:ascii="Arial" w:hAnsi="Arial" w:eastAsia="Arial"/>
           <w:color w:val="000000"/>
-          <w:sz w:val="15"/>
+          <w:sz w:val="16"/>
         </w:rPr>
         <w:t xml:space="preserve"> | Live: https://www.vibebatch.net | GitHub: github.com/saatvikraghuvanshi-lab/VibeBatch</w:t>
       </w:r>
@@ -460,7 +460,7 @@
         <w:rPr>
           <w:rFonts w:ascii="Arial" w:hAnsi="Arial" w:eastAsia="Arial"/>
           <w:color w:val="000000"/>
-          <w:sz w:val="15"/>
+          <w:sz w:val="16"/>
         </w:rPr>
         <w:t>- Architected Supabase/PostgreSQL data flows for user profiles, friend relationships, anonymous trait voting, messages, invite sharing, premium identity cards, Gemini help support, and Row Level Security-based privacy.</w:t>
       </w:r>
@@ -475,7 +475,7 @@
           <w:rFonts w:ascii="Arial" w:hAnsi="Arial" w:eastAsia="Arial"/>
           <w:b/>
           <w:color w:val="000000"/>
-          <w:sz w:val="16"/>
+          <w:sz w:val="17"/>
         </w:rPr>
         <w:t>ResilienceOS - Disaster Management Web Platform</w:t>
       </w:r>
@@ -483,7 +483,7 @@
         <w:rPr>
           <w:rFonts w:ascii="Arial" w:hAnsi="Arial" w:eastAsia="Arial"/>
           <w:color w:val="000000"/>
-          <w:sz w:val="15"/>
+          <w:sz w:val="16"/>
         </w:rPr>
         <w:t xml:space="preserve"> | Live: https://resilienceos.vercel.app | GitHub: github.com/saatvikraghuvanshi-lab/RESILIENCEOS</w:t>
       </w:r>
@@ -496,7 +496,7 @@
         <w:rPr>
           <w:rFonts w:ascii="Arial" w:hAnsi="Arial" w:eastAsia="Arial"/>
           <w:color w:val="000000"/>
-          <w:sz w:val="15"/>
+          <w:sz w:val="16"/>
         </w:rPr>
         <w:t>- Built role-based disaster-response workflows for admin command, responder tasks, civilian SOS reporting, map simulation, readiness training, strategic forecasting, and report generation; recognized as a 4th place Startup Forge Ideathon project.</w:t>
       </w:r>
@@ -511,7 +511,7 @@
           <w:rFonts w:ascii="Arial" w:hAnsi="Arial" w:eastAsia="Arial"/>
           <w:b/>
           <w:color w:val="000000"/>
-          <w:sz w:val="16"/>
+          <w:sz w:val="17"/>
         </w:rPr>
         <w:t>JanSahayak - AI Public Assistance Web Application</w:t>
       </w:r>
@@ -519,7 +519,7 @@
         <w:rPr>
           <w:rFonts w:ascii="Arial" w:hAnsi="Arial" w:eastAsia="Arial"/>
           <w:color w:val="000000"/>
-          <w:sz w:val="15"/>
+          <w:sz w:val="16"/>
         </w:rPr>
         <w:t xml:space="preserve"> | Live: https://jansahayak1.netlify.app</w:t>
       </w:r>
@@ -532,7 +532,7 @@
         <w:rPr>
           <w:rFonts w:ascii="Arial" w:hAnsi="Arial" w:eastAsia="Arial"/>
           <w:color w:val="000000"/>
-          <w:sz w:val="15"/>
+          <w:sz w:val="16"/>
         </w:rPr>
         <w:t>- Developed a civic-tech prototype for a college Vibeathon covering login, scheme discovery, filters, user dashboard, and AI assistant flow; placed in the top 5.</w:t>
       </w:r>
@@ -559,7 +559,7 @@
           <w:rFonts w:ascii="Arial" w:hAnsi="Arial" w:eastAsia="Arial"/>
           <w:b/>
           <w:color w:val="000000"/>
-          <w:sz w:val="16"/>
+          <w:sz w:val="17"/>
         </w:rPr>
         <w:t>Freelance Full-Stack Developer - VibeBatch</w:t>
       </w:r>
@@ -572,7 +572,7 @@
         <w:rPr>
           <w:rFonts w:ascii="Arial" w:hAnsi="Arial" w:eastAsia="Arial"/>
           <w:color w:val="000000"/>
-          <w:sz w:val="15"/>
+          <w:sz w:val="16"/>
         </w:rPr>
         <w:t>- Delivered a live freelance web product with frontend implementation, Supabase-backed workflows, authentication, database design, deployment readiness, and product UI refinement.</w:t>
       </w:r>
@@ -587,7 +587,7 @@
           <w:rFonts w:ascii="Arial" w:hAnsi="Arial" w:eastAsia="Arial"/>
           <w:b/>
           <w:color w:val="000000"/>
-          <w:sz w:val="16"/>
+          <w:sz w:val="17"/>
         </w:rPr>
         <w:t>Cloud Computing Training - Training Phase</w:t>
       </w:r>
@@ -600,7 +600,7 @@
         <w:rPr>
           <w:rFonts w:ascii="Arial" w:hAnsi="Arial" w:eastAsia="Arial"/>
           <w:color w:val="000000"/>
-          <w:sz w:val="15"/>
+          <w:sz w:val="16"/>
         </w:rPr>
         <w:t>- Building foundational cloud computing knowledge aligned with cloud engineering internships, deployment workflows, backend services, and infrastructure fundamentals.</w:t>
       </w:r>
@@ -625,7 +625,7 @@
         <w:rPr>
           <w:rFonts w:ascii="Arial" w:hAnsi="Arial" w:eastAsia="Arial"/>
           <w:color w:val="000000"/>
-          <w:sz w:val="15"/>
+          <w:sz w:val="16"/>
         </w:rPr>
         <w:t>- INDIA.RUNS 2026 Ideathon: Built ShockProof for Challenge 3, Improve Everyday Life with AI, as part of team Noble Dawn.</w:t>
       </w:r>
@@ -638,7 +638,7 @@
         <w:rPr>
           <w:rFonts w:ascii="Arial" w:hAnsi="Arial" w:eastAsia="Arial"/>
           <w:color w:val="000000"/>
-          <w:sz w:val="15"/>
+          <w:sz w:val="16"/>
         </w:rPr>
         <w:t>- Startup Forge Ideathon: 4th Place Finisher, GCEC Global Foundation, for ResilienceOS during a 48-hour build.</w:t>
       </w:r>
@@ -651,7 +651,7 @@
         <w:rPr>
           <w:rFonts w:ascii="Arial" w:hAnsi="Arial" w:eastAsia="Arial"/>
           <w:color w:val="000000"/>
-          <w:sz w:val="15"/>
+          <w:sz w:val="16"/>
         </w:rPr>
         <w:t>- Technical workshops and hackathons: Rewind &amp; Recode National Hackathon, Robotics Workshop at Techfest IIT Bombay, WRC Quadcopter Challenge, Fastest Line Follower Challenge, Machine Learning Workshop, and AI/Prompt Engineering career session.</w:t>
       </w:r>
@@ -1030,12 +1030,12 @@
     <w:qFormat/>
     <w:rsid w:val="00FC693F"/>
     <w:pPr>
-      <w:spacing w:after="24" w:line="240" w:lineRule="auto"/>
+      <w:spacing w:after="27" w:line="240" w:lineRule="auto"/>
     </w:pPr>
     <w:rPr>
       <w:rFonts w:ascii="Arial" w:hAnsi="Arial" w:eastAsia="Arial"/>
       <w:color w:val="000000"/>
-      <w:sz w:val="17"/>
+      <w:sz w:val="19"/>
     </w:rPr>
   </w:style>
   <w:style w:type="paragraph" w:styleId="Header">
@@ -12724,46 +12724,46 @@
     <w:name w:val="Resume Heading"/>
     <w:basedOn w:val="Normal"/>
     <w:pPr>
-      <w:spacing w:before="84" w:after="24" w:line="240" w:lineRule="auto"/>
+      <w:spacing w:before="94" w:after="27" w:line="240" w:lineRule="auto"/>
     </w:pPr>
     <w:rPr>
       <w:rFonts w:ascii="Arial" w:hAnsi="Arial" w:eastAsia="Arial"/>
       <w:b/>
-      <w:sz w:val="19"/>
+      <w:sz w:val="21"/>
     </w:rPr>
   </w:style>
   <w:style w:type="paragraph" w:customStyle="1" w:styleId="ResumeRole">
     <w:name w:val="Resume Role"/>
     <w:basedOn w:val="Normal"/>
     <w:pPr>
-      <w:spacing w:before="28" w:after="8" w:line="240" w:lineRule="auto"/>
+      <w:spacing w:before="32" w:after="11" w:line="240" w:lineRule="auto"/>
+    </w:pPr>
+    <w:rPr>
+      <w:rFonts w:ascii="Arial" w:hAnsi="Arial" w:eastAsia="Arial"/>
+      <w:sz w:val="19"/>
+    </w:rPr>
+  </w:style>
+  <w:style w:type="paragraph" w:customStyle="1" w:styleId="ResumeBullet">
+    <w:name w:val="Resume Bullet"/>
+    <w:basedOn w:val="Normal"/>
+    <w:pPr>
+      <w:spacing w:after="13" w:line="235" w:lineRule="auto"/>
+      <w:ind w:left="173" w:hanging="173"/>
     </w:pPr>
     <w:rPr>
       <w:rFonts w:ascii="Arial" w:hAnsi="Arial" w:eastAsia="Arial"/>
       <w:sz w:val="17"/>
     </w:rPr>
   </w:style>
-  <w:style w:type="paragraph" w:customStyle="1" w:styleId="ResumeBullet">
-    <w:name w:val="Resume Bullet"/>
-    <w:basedOn w:val="Normal"/>
-    <w:pPr>
-      <w:spacing w:after="10" w:line="235" w:lineRule="auto"/>
-      <w:ind w:left="173" w:hanging="173"/>
-    </w:pPr>
-    <w:rPr>
-      <w:rFonts w:ascii="Arial" w:hAnsi="Arial" w:eastAsia="Arial"/>
-      <w:sz w:val="16"/>
-    </w:rPr>
-  </w:style>
   <w:style w:type="paragraph" w:customStyle="1" w:styleId="ResumePair">
     <w:name w:val="Resume Pair"/>
     <w:basedOn w:val="Normal"/>
     <w:pPr>
-      <w:spacing w:after="12" w:line="235" w:lineRule="auto"/>
+      <w:spacing w:after="15" w:line="235" w:lineRule="auto"/>
     </w:pPr>
     <w:rPr>
       <w:rFonts w:ascii="Arial" w:hAnsi="Arial" w:eastAsia="Arial"/>
-      <w:sz w:val="16"/>
+      <w:sz w:val="17"/>
     </w:rPr>
   </w:style>
 </w:styles>

</xml_diff>

<commit_message>
Redesign portfolio with burgundy/black theme, add EcoCity & Lunar Ice projects, update resume
- Complete UI redesign: black/burgundy/white color theme, Space Grotesk typography,
  motion.dev scroll animations, modern brutalist aesthetic
- Add EcoCity Heat Planner project with 8 gallery screenshots (Craft N Code hackathon)
- Add Lunar Ice Intelligence project with 9 gallery screenshots (ISRO Bharatiya Antariksh)
- Add new skills: Docker, Linux, CI/CD, Microsoft Azure, Azure Databricks, Azure SQL, Prisma
- Add certifications: Cybersecurity & Cloud Computing (Interns Elite), AI Tools Workshop (be10x)
- Update resume with Interns Elite cert, be10x workshop, new cloud/devops skills
- Add scroll hint, achievement year badges, animated project card hover effects

🤖 Generated with Codebuff
Co-Authored-By: Codebuff <noreply@codebuff.com>
</commit_message>
<xml_diff>
--- a/Saatvik_Raghuvanshi_Resume_ATS.docx
+++ b/Saatvik_Raghuvanshi_Resume_ATS.docx
@@ -223,7 +223,7 @@
           <w:color w:val="000000"/>
           <w:sz w:val="16"/>
         </w:rPr>
-        <w:t xml:space="preserve">AI, Cloud and Tools: </w:t>
+        <w:t xml:space="preserve">AI and Tools: </w:t>
       </w:r>
       <w:r>
         <w:rPr>
@@ -231,7 +231,29 @@
           <w:color w:val="000000"/>
           <w:sz w:val="16"/>
         </w:rPr>
-        <w:t>Gemini API, Inngest, Firebase, Google Cloud, Vercel, Netlify, Git, GitHub, ngrok</w:t>
+        <w:t>Gemini API, Inngest, Firebase, Google Cloud, Vercel, Netlify, Git, GitHub, ngrok, Prisma</w:t>
+      </w:r>
+    </w:p>
+    <w:p>
+      <w:pPr>
+        <w:pStyle w:val="ResumePair"/>
+      </w:pPr>
+      <w:r>
+        <w:rPr>
+          <w:rFonts w:ascii="Arial" w:hAnsi="Arial" w:eastAsia="Arial"/>
+          <w:b/>
+          <w:color w:val="000000"/>
+          <w:sz w:val="16"/>
+        </w:rPr>
+        <w:t xml:space="preserve">Cloud and DevOps: </w:t>
+      </w:r>
+      <w:r>
+        <w:rPr>
+          <w:rFonts w:ascii="Arial" w:hAnsi="Arial" w:eastAsia="Arial"/>
+          <w:color w:val="000000"/>
+          <w:sz w:val="16"/>
+        </w:rPr>
+        <w:t>Microsoft Azure, Azure Databricks, Azure SQL, Docker, CI/CD, Linux, Linux Kernel</w:t>
       </w:r>
     </w:p>
     <w:p>
@@ -607,6 +629,42 @@
     </w:p>
     <w:p>
       <w:pPr>
+        <w:pStyle w:val="ResumeRole"/>
+        <w:keepNext/>
+      </w:pPr>
+      <w:r>
+        <w:rPr>
+          <w:rFonts w:ascii="Arial" w:hAnsi="Arial" w:eastAsia="Arial"/>
+          <w:b/>
+          <w:color w:val="000000"/>
+          <w:sz w:val="17"/>
+        </w:rPr>
+        <w:t>Cybersecurity &amp; Cloud Computing Certificate | Interns Elite</w:t>
+      </w:r>
+      <w:r>
+        <w:rPr>
+          <w:rFonts w:ascii="Arial" w:hAnsi="Arial" w:eastAsia="Arial"/>
+          <w:color w:val="000000"/>
+          <w:sz w:val="16"/>
+        </w:rPr>
+        <w:t xml:space="preserve"> | May 2026 - July 2026 | Remote</w:t>
+      </w:r>
+    </w:p>
+    <w:p>
+      <w:pPr>
+        <w:pStyle w:val="ResumeBullet"/>
+      </w:pPr>
+      <w:r>
+        <w:rPr>
+          <w:rFonts w:ascii="Arial" w:hAnsi="Arial" w:eastAsia="Arial"/>
+          <w:color w:val="000000"/>
+          <w:sz w:val="16"/>
+        </w:rPr>
+        <w:t>- Completed a structured program covering cybersecurity fundamentals, cloud infrastructure, Azure services, Docker containerization, CI/CD pipelines, and Linux system administration.</w:t>
+      </w:r>
+    </w:p>
+    <w:p>
+      <w:pPr>
         <w:pStyle w:val="ResumeHeading"/>
         <w:keepNext/>
         <w:pBdr>
@@ -641,6 +699,45 @@
           <w:sz w:val="16"/>
         </w:rPr>
         <w:t>- Startup Forge Ideathon: 4th Place Finisher, GCEC Global Foundation, for ResilienceOS during a 48-hour build.</w:t>
+      </w:r>
+    </w:p>
+    <w:p>
+      <w:pPr>
+        <w:pStyle w:val="ResumeBullet"/>
+      </w:pPr>
+      <w:r>
+        <w:rPr>
+          <w:rFonts w:ascii="Arial" w:hAnsi="Arial" w:eastAsia="Arial"/>
+          <w:color w:val="000000"/>
+          <w:sz w:val="16"/>
+        </w:rPr>
+        <w:t>- Craft N Code Hackathon: Cyber Space Club, MUJ in collaboration with Techfest IIIT Bhubaneswar; built EcoCity Heat Planner for urban heat island mitigation.</w:t>
+      </w:r>
+    </w:p>
+    <w:p>
+      <w:pPr>
+        <w:pStyle w:val="ResumeBullet"/>
+      </w:pPr>
+      <w:r>
+        <w:rPr>
+          <w:rFonts w:ascii="Arial" w:hAnsi="Arial" w:eastAsia="Arial"/>
+          <w:color w:val="000000"/>
+          <w:sz w:val="16"/>
+        </w:rPr>
+        <w:t>- Bharatiya Antariksh Hackathon 2026: ISRO Problem Statement 8; built Lunar Ice Intelligence for subsurface ice detection using Chandrayaan-2 data.</w:t>
+      </w:r>
+    </w:p>
+    <w:p>
+      <w:pPr>
+        <w:pStyle w:val="ResumeBullet"/>
+      </w:pPr>
+      <w:r>
+        <w:rPr>
+          <w:rFonts w:ascii="Arial" w:hAnsi="Arial" w:eastAsia="Arial"/>
+          <w:color w:val="000000"/>
+          <w:sz w:val="16"/>
+        </w:rPr>
+        <w:t>- AI Tools Workshop Completion Certificate: be10x; mastered AI-driven productivity tools including NotebookLM, Wispr Flow AI, Google Stitch, Google AI Studio, Claude AI, Julius AI, Codex by OpenAI, Comet, and n8n.</w:t>
       </w:r>
     </w:p>
     <w:p>

</xml_diff>